<commit_message>
dokumentacio: veglegesitett munkamegosztas (4.3) es a tanarral egyeztetett kivalasztott kodresz (2.5)
</commit_message>
<xml_diff>
--- a/dokumentum/QuizArena_szoftverdokumentacio.docx
+++ b/dokumentum/QuizArena_szoftverdokumentacio.docx
@@ -2480,7 +2480,7 @@
         <w:spacing w:after="160" w:line="300" w:lineRule="auto"/>
       </w:pPr>
       <w:r>
-        <w:t>(Ez a rész a tanárral egyeztetve, közösen választható ki — az alábbi a saját javaslatunk: a szerveroldali, csalásbiztos pontszámítás és válaszkezelés, mert ez az alkalmazás legkritikusabb üzleti logikája.)</w:t>
+        <w:t>(A tanárral egyeztetve az alábbi rész került kiválasztásra bemutatásra: a szerveroldali, csalásbiztos pontszámítás és válaszkezelés, mivel ez az alkalmazás legkritikusabb üzleti logikája.)</w:t>
       </w:r>
     </w:p>
     <w:p>
@@ -5291,15 +5291,7 @@
         <w:spacing w:after="160" w:line="300" w:lineRule="auto"/>
       </w:pPr>
       <w:r>
-        <w:t>[Ezt a részt egyeztetve, a tényleges munkamegosztás alapján töltsétek ki — pl. ki dolgozott inkább a backenden/frontend­en/adatbázis-terven, hogyan egyeztettetek (Git commitok, közös ülések), mi volt jó a közös munkában. Az alábbi egy kiindulási vázlat:]</w:t>
-      </w:r>
-    </w:p>
-    <w:p>
-      <w:pPr>
-        <w:spacing w:after="160" w:line="300" w:lineRule="auto"/>
-      </w:pPr>
-      <w:r>
-        <w:t>A fejlesztés két fő területre bontva zajlott: a backend (Express-végpontok, adatbázis-séma, pontszámítási logika) és a frontend (HTML/CSS/JS oldalak, felhasználói élmény) között. A csapat rendszeresen egyeztetett a haladásról, és a Git-en keresztül közösen vitte előre a kódbázist. A közös munka legnagyobb tanulsága [ide írjátok be a saját tapasztalatotokat].</w:t>
+        <w:t>A munka egyértelműen két fő területre oszlott. Perger Balázs felelt a teljes backend fejlesztéséért — az Express-alapú szerverért, az API-végpontokért, az adatbázis-sémáért, valamint a csalásbiztos válaszkezelés és a pontszámítási logika megvalósításáért —, továbbá a kérdésbank tartalmi kutatómunkájáért, vagyis a kvízkérdések és a hozzájuk tartozó válaszlehetőségek összeállításáért és ellenőrzéséért. Pintér Szabolcs felelt a teljes felhasználói felületért: a frontend HTML/CSS/JavaScript kódjáért, a felület tervezéséért és a vizuális designért (elrendezés, színvilág, ikonok, reszponzív megjelenés). A két terület az API-kontraktusok kialakításánál és a közös teszteléseknél ért össze, ezekben mindketten részt vettek.</w:t>
       </w:r>
     </w:p>
     <w:p>

</xml_diff>